<commit_message>
Integrate workshop poster and harmonize fictional Madame Samira case
</commit_message>
<xml_diff>
--- a/public/ressources/guide-complet-module-01-LN-IA.docx
+++ b/public/ressources/guide-complet-module-01-LN-IA.docx
@@ -4475,7 +4475,7 @@
     <w:p>
       <w:pPr/>
       <w:r>
-        <w:t>Samira Benali est une coach fictive en organisation. Elle souhaite préparer une fiche expliquant le premier échange avec un indépendant. Le cas poursuit la carte d’usages présentée à la séance 03.</w:t>
+        <w:t>Madame Samira est une coach fictive en organisation. Elle souhaite préparer une fiche expliquant le premier échange avec un indépendant. Le cas poursuit la carte d’usages présentée à la séance 03.</w:t>
       </w:r>
     </w:p>
     <w:p>
@@ -4618,7 +4618,7 @@
           <w:rFonts w:ascii="DejaVu Sans Mono" w:hAnsi="DejaVu Sans Mono"/>
           <w:sz w:val="17"/>
         </w:rPr>
-        <w:t>avec Samira Benali, coach en organisation.</w:t>
+        <w:t>avec Madame Samira, coach en organisation.</w:t>
       </w:r>
     </w:p>
     <w:p>
@@ -4760,7 +4760,7 @@
           <w:rFonts w:ascii="DejaVu Sans Mono" w:hAnsi="DejaVu Sans Mono"/>
           <w:sz w:val="17"/>
         </w:rPr>
-        <w:t>Bienvenue chez Samira Benali, coach certifiée en organisation.</w:t>
+        <w:t>Bienvenue chez Madame Samira, coach certifiée en organisation.</w:t>
       </w:r>
     </w:p>
     <w:p>
@@ -5335,7 +5335,7 @@
     <w:p>
       <w:pPr/>
       <w:r>
-        <w:t>Cette fiche s’adresse aux indépendants qui souhaitent clarifier leurs priorités et mieux organiser leur travail. Samira Benali propose un accompagnement à l’organisation à distance.</w:t>
+        <w:t>Cette fiche s’adresse aux indépendants qui souhaitent clarifier leurs priorités et mieux organiser leur travail. Madame Samira propose un accompagnement à l’organisation à distance.</w:t>
       </w:r>
     </w:p>
     <w:p>
@@ -5377,7 +5377,7 @@
     <w:p>
       <w:pPr/>
       <w:r>
-        <w:t>Vous présentez votre priorité. Vous expliquez ensuite ce qui vous empêche d’avancer. Avec Samira, vous clarifiez le besoin et choisissez une première action. Vous gardez la décision sur les informations que vous partagez et sur l’action que vous souhaitez engager.</w:t>
+        <w:t>Vous présentez votre priorité. Vous expliquez ensuite ce qui vous empêche d’avancer. Avec Madame Samira, vous clarifiez le besoin et choisissez une première action. Vous gardez la décision sur les informations que vous partagez et sur l’action que vous souhaitez engager.</w:t>
       </w:r>
     </w:p>
     <w:p>

</xml_diff>

<commit_message>
Simplify workshop instructions in candidate presentation and guides
</commit_message>
<xml_diff>
--- a/public/ressources/guide-complet-module-01-LN-IA.docx
+++ b/public/ressources/guide-complet-module-01-LN-IA.docx
@@ -7188,26 +7188,6 @@
         <w:pStyle w:val="Heading2"/>
       </w:pPr>
       <w:r>
-        <w:t>Utiliser le pack dans VS Code</w:t>
-      </w:r>
-    </w:p>
-    <w:p>
-      <w:pPr/>
-      <w:r>
-        <w:t>Ouvrir atelier-seance-04-LN-IA. Installer les dépendances avec npm ci puis lancer npm run dev. Copier PROMPT-PILOTAGE-CODEX.md dans Codex pour inspecter et poursuivre le projet. Les consignes locales sont dans AGENTS.md.</w:t>
-      </w:r>
-    </w:p>
-    <w:p>
-      <w:pPr/>
-      <w:r>
-        <w:t>La commande npm run demo copie les fichiers de démonstration préparés dans un nouveau dossier travail-local et génère une trace technique. Elle ne lance pas d’IA et n’atteste pas une relecture humaine. Une véritable nouvelle production se fait à partir du prompt et des entrées fournis.</w:t>
-      </w:r>
-    </w:p>
-    <w:p>
-      <w:pPr>
-        <w:pStyle w:val="Heading2"/>
-      </w:pPr>
-      <w:r>
         <w:t>Préparer le module 02</w:t>
       </w:r>
     </w:p>

</xml_diff>